<commit_message>
Reverte caminho de exemplo do Manual do Gestor pra este PC
Produção voltou a rodar em C:\Users\DPTO FISCAL 004\GUSTAVO\claudio
(o PC do Vitor foi abandonado). Atualiza as 11 menções de exemplo que
citavam C:\Users\Vitor\Desktop\claudio(-teste).

Co-Authored-By: Claude Sonnet 5 <noreply@anthropic.com>
</commit_message>
<xml_diff>
--- a/MANUAIS/Manual do Gestor - Organizacao Claudio Secretario.docx
+++ b/MANUAIS/Manual do Gestor - Organizacao Claudio Secretario.docx
@@ -113,7 +113,7 @@
           <w:sz w:val="20"/>
           <w:szCs w:val="20"/>
         </w:rPr>
-        <w:t>Convenção usada neste documento (atualizada 31/08/2026): RAIZ_REGRAS é a raiz do repositório de regras desta sessão, resolvida a cada execução com git rev-parse --show-toplevel, nunca escrita fixa — produção é C:\Users\Vitor\Desktop\claudio (branch main), teste é C:\Users\Vitor\Desktop\claudio-teste (branch teste). Caminhos abreviados como _CLAUDIO_CONTROLE\... continuam se referindo a G:\Meu Drive\CLAUDE FAVOR NÃO MEXER\_CLAUDIO_CONTROLE\..., mas essa pasta hoje só guarda dado de execução (LOGS, MANIFESTO, BACKUP ROTINA, STAGING, HISTORICO) — as regras não ficam mais lá, ver capítulo 2.</w:t>
+        <w:t>Convenção usada neste documento (atualizada 31/08/2026): RAIZ_REGRAS é a raiz do repositório de regras desta sessão, resolvida a cada execução com git rev-parse --show-toplevel, nunca escrita fixa — produção é C:\Users\DPTO FISCAL 004\GUSTAVO\claudio (branch main), teste é C:\Users\DPTO FISCAL 004\GUSTAVO\claudio-teste (branch teste). Caminhos abreviados como _CLAUDIO_CONTROLE\... continuam se referindo a G:\Meu Drive\CLAUDE FAVOR NÃO MEXER\_CLAUDIO_CONTROLE\..., mas essa pasta hoje só guarda dado de execução (LOGS, MANIFESTO, BACKUP ROTINA, STAGING, HISTORICO) — as regras não ficam mais lá, ver capítulo 2.</w:t>
       </w:r>
     </w:p>
     <w:p>
@@ -1544,7 +1544,7 @@
           <w:szCs w:val="20"/>
           <w:u w:val="single"/>
         </w:rPr>
-        <w:t xml:space="preserve">Nota sobre .claude (resolvido 31/08/2026): comandos e subagentes ficam em RAIZ_REGRAS\.claude\, dentro do próprio repositório de regras — já não dependem de estar na raiz de nenhuma pasta do Drive. A sessão do Claude Code precisa ser aberta com a pasta primária em RAIZ_REGRAS (ex.: C:\Users\Vitor\Desktop\claudio) para /organizar, /log e os subagentes serem reconhecidos. O acesso aos dados do cliente no Drive vem de additionalDirectories em .claude\settings.local.json (ver capítulo 10). </w:t>
+        <w:t xml:space="preserve">Nota sobre .claude (resolvido 31/08/2026): comandos e subagentes ficam em RAIZ_REGRAS\.claude\, dentro do próprio repositório de regras — já não dependem de estar na raiz de nenhuma pasta do Drive. A sessão do Claude Code precisa ser aberta com a pasta primária em RAIZ_REGRAS (ex.: C:\Users\DPTO FISCAL 004\GUSTAVO\claudio) para /organizar, /log e os subagentes serem reconhecidos. O acesso aos dados do cliente no Drive vem de additionalDirectories em .claude\settings.local.json (ver capítulo 10). </w:t>
         <w:lastRenderedPageBreak/>
         <w:t/>
       </w:r>
@@ -9245,7 +9245,7 @@
         <w:spacing w:after="90"/>
       </w:pPr>
       <w:r>
-        <w:t xml:space="preserve">O repositório de regras (RAIZ_REGRAS) mudou de lugar em 31/08/2026: não fica mais dentro do Google Drive (a sincronização do Drive mexe em arquivo enquanto o git trabalha e corrompe repositório) — hoje é C:\Users\Vitor\Desktop\claudio em disco local, branch main. Versiona Dicionário, os 15 arquivos de agente (necessario para o claude\agentes\), os subagentes (.claude\agents\), os comandos (.claude\commands\), os MANUAIS e a pasta dados agentes (planilha de cadastro de clientes e exemplos de referência incluídos por decisão explícita do responsável, repositório privado). Nunca versiona LOGS, MANIFESTO, BACKUP ROTINA, STAGING ou HISTORICO — esses continuam só no Drive, em _CLAUDIO_CONTROLE (ver .gitignore).</w:t>
+        <w:t xml:space="preserve">O repositório de regras (RAIZ_REGRAS) mudou de lugar em 31/08/2026: não fica mais dentro do Google Drive (a sincronização do Drive mexe em arquivo enquanto o git trabalha e corrompe repositório) — hoje é C:\Users\DPTO FISCAL 004\GUSTAVO\claudio em disco local, branch main. Versiona Dicionário, os 15 arquivos de agente (necessario para o claude\agentes\), os subagentes (.claude\agents\), os comandos (.claude\commands\), os MANUAIS e a pasta dados agentes (planilha de cadastro de clientes e exemplos de referência incluídos por decisão explícita do responsável, repositório privado). Nunca versiona LOGS, MANIFESTO, BACKUP ROTINA, STAGING ou HISTORICO — esses continuam só no Drive, em _CLAUDIO_CONTROLE (ver .gitignore).</w:t>
       </w:r>
     </w:p>
     <w:p>
@@ -9258,7 +9258,7 @@
         <w:spacing w:after="90"/>
       </w:pPr>
       <w:r>
-        <w:t xml:space="preserve">Ver o histórico: abrir terminal em RAIZ_REGRAS (produção: C:\Users\Vitor\Desktop\claudio) e rodar `git log --oneline` (lista todas as mudanças) ou `git log -p 00-DICIONARIO-CANONICO.md` (mudanças só nesse arquivo, com o diff).</w:t>
+        <w:t xml:space="preserve">Ver o histórico: abrir terminal em RAIZ_REGRAS (produção: C:\Users\DPTO FISCAL 004\GUSTAVO\claudio) e rodar `git log --oneline` (lista todas as mudanças) ou `git log -p 00-DICIONARIO-CANONICO.md` (mudanças só nesse arquivo, com o diff).</w:t>
       </w:r>
     </w:p>
     <w:p>
@@ -9284,7 +9284,7 @@
         <w:spacing w:after="90"/>
       </w:pPr>
       <w:r>
-        <w:t xml:space="preserve">Toda mudança deve ser feita primeiro na branch teste (RAIZ_REGRAS = C:\Users\Vitor\Desktop\claudio-teste) e validada com /organizar SIMULACAO antes de ir pra main — só depois disso fazer merge/push pra main. Depois de editar manualmente um arquivo de agente (fora de uma sessão do Claude Code), registre a mudança: `git add -A &amp;&amp; git commit -m "descrição curta da mudança"` — sem isso, a edição existe no disco mas não fica no histórico.</w:t>
+        <w:t xml:space="preserve">Toda mudança deve ser feita primeiro na branch teste (RAIZ_REGRAS = C:\Users\DPTO FISCAL 004\GUSTAVO\claudio-teste) e validada com /organizar SIMULACAO antes de ir pra main — só depois disso fazer merge/push pra main. Depois de editar manualmente um arquivo de agente (fora de uma sessão do Claude Code), registre a mudança: `git add -A &amp;&amp; git commit -m "descrição curta da mudança"` — sem isso, a edição existe no disco mas não fica no histórico.</w:t>
       </w:r>
     </w:p>
     <w:p>
@@ -9638,7 +9638,7 @@
         <w:spacing w:after="140"/>
       </w:pPr>
       <w:r>
-        <w:t xml:space="preserve">Como o repositório de regras saiu do Drive, a sessão do Claude Code precisa ser aberta com a pasta primária dentro de RAIZ_REGRAS (produção: C:\Users\Vitor\Desktop\claudio) — nunca em C:\ solto, numa pasta pai, ou no Drive. A Fase 0 do Orquestrador confere isso sozinha (git rev-parse --show-toplevel) e para com FALHA_DE_INFRAESTRUTURA se não bater, em vez de adivinhar — essa checagem é proposital, evita rodar com uma combinação errada de regra e dado sem ninguém notar. Se aparecer esse erro, feche a sessão e abra de novo na pasta certa.</w:t>
+        <w:t xml:space="preserve">Como o repositório de regras saiu do Drive, a sessão do Claude Code precisa ser aberta com a pasta primária dentro de RAIZ_REGRAS (produção: C:\Users\DPTO FISCAL 004\GUSTAVO\claudio) — nunca em C:\ solto, numa pasta pai, ou no Drive. A Fase 0 do Orquestrador confere isso sozinha (git rev-parse --show-toplevel) e para com FALHA_DE_INFRAESTRUTURA se não bater, em vez de adivinhar — essa checagem é proposital, evita rodar com uma combinação errada de regra e dado sem ninguém notar. Se aparecer esse erro, feche a sessão e abra de novo na pasta certa.</w:t>
       </w:r>
     </w:p>
     <w:p>
@@ -10116,7 +10116,7 @@
         <w:spacing w:after="140"/>
       </w:pPr>
       <w:r>
-        <w:t xml:space="preserve">O repositório git que antes vivia dentro de _CLAUDIO_CONTROLE, no Drive, foi movido para disco local (C:\Users\Vitor\Desktop\claudio, branch main) — a sincronização do Google Drive mexe em arquivo enquanto o git trabalha, o que corrompe repositório (a própria pasta MANUAIS travou por permissão durante a migração, evidenciando o problema). Caminho de regra passou a ser sempre relativo a RAIZ_REGRAS, resolvida via git rev-parse --show-toplevel na Fase 0; caminho de dado continua absoluto no Drive, idêntico nos dois ambientes. O acesso ao Drive a partir da sessão local é concedido por additionalDirectories em .claude\settings.local.json, sem prompt a cada execução.</w:t>
+        <w:t xml:space="preserve">O repositório git que antes vivia dentro de _CLAUDIO_CONTROLE, no Drive, foi movido para disco local (C:\Users\DPTO FISCAL 004\GUSTAVO\claudio, branch main) — a sincronização do Google Drive mexe em arquivo enquanto o git trabalha, o que corrompe repositório (a própria pasta MANUAIS travou por permissão durante a migração, evidenciando o problema). Caminho de regra passou a ser sempre relativo a RAIZ_REGRAS, resolvida via git rev-parse --show-toplevel na Fase 0; caminho de dado continua absoluto no Drive, idêntico nos dois ambientes. O acesso ao Drive a partir da sessão local é concedido por additionalDirectories em .claude\settings.local.json, sem prompt a cada execução.</w:t>
       </w:r>
     </w:p>
     <w:p>
@@ -10188,7 +10188,7 @@
         <w:spacing w:after="140"/>
       </w:pPr>
       <w:r>
-        <w:t xml:space="preserve">Passou a existir um clone separado, fora do Drive (C:\Users\Vitor\Desktop\claudio-teste, branch teste), pra testar mudança de regra com /organizar SIMULACAO sobre os dados reais sem risco — a pasta de produção nunca troca de branch pra isso. Regra aprovada na teste é mesclada pra main depois de validada; regra nunca vai direto pra produção sem passar por lá primeiro (ver capítulo 9).</w:t>
+        <w:t xml:space="preserve">Passou a existir um clone separado, fora do Drive (C:\Users\DPTO FISCAL 004\GUSTAVO\claudio-teste, branch teste), pra testar mudança de regra com /organizar SIMULACAO sobre os dados reais sem risco — a pasta de produção nunca troca de branch pra isso. Regra aprovada na teste é mesclada pra main depois de validada; regra nunca vai direto pra produção sem passar por lá primeiro (ver capítulo 9).</w:t>
       </w:r>
     </w:p>
     <w:p>
@@ -10899,7 +10899,7 @@
                 <w:sz w:val="18"/>
                 <w:szCs w:val="18"/>
               </w:rPr>
-              <w:t>Raiz do repositório de regras da sessão atual, resolvida a cada execução com git rev-parse --show-toplevel (nunca escrita fixa). Produção: C:\Users\Vitor\Desktop\claudio, branch main. Teste: C:\Users\Vitor\Desktop\claudio-teste, branch teste. Diferente de caminho de dado (origem, 2026, LOGS, MANIFESTO, BACKUP ROTINA, STAGING), que continua absoluto no Drive nos dois ambientes.</w:t>
+              <w:t>Raiz do repositório de regras da sessão atual, resolvida a cada execução com git rev-parse --show-toplevel (nunca escrita fixa). Produção: C:\Users\DPTO FISCAL 004\GUSTAVO\claudio, branch main. Teste: C:\Users\DPTO FISCAL 004\GUSTAVO\claudio-teste, branch teste. Diferente de caminho de dado (origem, 2026, LOGS, MANIFESTO, BACKUP ROTINA, STAGING), que continua absoluto no Drive nos dois ambientes.</w:t>
             </w:r>
           </w:p>
         </w:tc>

</xml_diff>